<commit_message>
Update customs HS8 trends and detail UI
</commit_message>
<xml_diff>
--- a/public/reports/battery.docx
+++ b/public/reports/battery.docx
@@ -406,6 +406,1176 @@
     </w:p>
     <w:p>
       <w:pPr>
+        <w:pStyle w:val="Heading2"/>
+      </w:pPr>
+      <w:r>
+        <w:t>中国海关 HS8 出口镜像数据（2025）</w:t>
+      </w:r>
+    </w:p>
+    <w:p>
+      <w:r>
+        <w:t>用户提供的中国海关明细包含 63 行记录，口径为中国出口至印度、HS8 85076000、2025 年1—12月。各月明细汇总为 26.84 十亿元人民币、989,574,853 个和 275,277,350 千克；12 个月合计与年度汇总一致。</w:t>
+      </w:r>
+    </w:p>
+    <w:p>
+      <w:r>
+        <w:t>该数据是中国出口镜像口径，币种为人民币；不直接替代印度报告的 CIF 进口额、印度全球进口额或对华来源占比。它用于验证月度方向、数量与贸易方式结构。</w:t>
+      </w:r>
+    </w:p>
+    <w:tbl>
+      <w:tblPr>
+        <w:tblStyle w:val="TableGrid"/>
+        <w:jc w:val="center"/>
+        <w:tblLook w:firstColumn="1" w:firstRow="1" w:lastColumn="0" w:lastRow="0" w:noHBand="0" w:noVBand="1" w:val="04A0"/>
+        <w:tblW w:w="9360" w:type="dxa"/>
+        <w:tblInd w:w="120" w:type="dxa"/>
+        <w:tblLayout w:type="fixed"/>
+        <w:tblCellMar>
+          <w:top w:w="80" w:type="dxa"/>
+          <w:start w:w="120" w:type="dxa"/>
+          <w:bottom w:w="80" w:type="dxa"/>
+          <w:end w:w="120" w:type="dxa"/>
+        </w:tblCellMar>
+      </w:tblPr>
+      <w:tblGrid>
+        <w:gridCol w:w="1200"/>
+        <w:gridCol w:w="2200"/>
+        <w:gridCol w:w="2880"/>
+        <w:gridCol w:w="3080"/>
+      </w:tblGrid>
+      <w:tr>
+        <w:trPr>
+          <w:tblHeader w:val="true"/>
+        </w:trPr>
+        <w:tc>
+          <w:tcPr>
+            <w:tcW w:type="dxa" w:w="1200"/>
+            <w:shd w:fill="F2F4F7"/>
+            <w:vAlign w:val="center"/>
+          </w:tcPr>
+          <w:p>
+            <w:pPr>
+              <w:spacing w:after="0"/>
+            </w:pPr>
+            <w:r/>
+            <w:r>
+              <w:rPr>
+                <w:rFonts w:ascii="Microsoft YaHei" w:hAnsi="Microsoft YaHei" w:eastAsia="Microsoft YaHei"/>
+                <w:b/>
+                <w:color w:val="1F4D78"/>
+                <w:sz w:val="19"/>
+              </w:rPr>
+              <w:t>月份</w:t>
+            </w:r>
+          </w:p>
+        </w:tc>
+        <w:tc>
+          <w:tcPr>
+            <w:tcW w:type="dxa" w:w="2200"/>
+            <w:shd w:fill="F2F4F7"/>
+            <w:vAlign w:val="center"/>
+          </w:tcPr>
+          <w:p>
+            <w:pPr>
+              <w:spacing w:after="0"/>
+            </w:pPr>
+            <w:r/>
+            <w:r>
+              <w:rPr>
+                <w:rFonts w:ascii="Microsoft YaHei" w:hAnsi="Microsoft YaHei" w:eastAsia="Microsoft YaHei"/>
+                <w:b/>
+                <w:color w:val="1F4D78"/>
+                <w:sz w:val="19"/>
+              </w:rPr>
+              <w:t>出口额（人民币）</w:t>
+            </w:r>
+          </w:p>
+        </w:tc>
+        <w:tc>
+          <w:tcPr>
+            <w:tcW w:type="dxa" w:w="2880"/>
+            <w:shd w:fill="F2F4F7"/>
+            <w:vAlign w:val="center"/>
+          </w:tcPr>
+          <w:p>
+            <w:pPr>
+              <w:spacing w:after="0"/>
+            </w:pPr>
+            <w:r/>
+            <w:r>
+              <w:rPr>
+                <w:rFonts w:ascii="Microsoft YaHei" w:hAnsi="Microsoft YaHei" w:eastAsia="Microsoft YaHei"/>
+                <w:b/>
+                <w:color w:val="1F4D78"/>
+                <w:sz w:val="19"/>
+              </w:rPr>
+              <w:t>第一数量（个）</w:t>
+            </w:r>
+          </w:p>
+        </w:tc>
+        <w:tc>
+          <w:tcPr>
+            <w:tcW w:type="dxa" w:w="3080"/>
+            <w:shd w:fill="F2F4F7"/>
+            <w:vAlign w:val="center"/>
+          </w:tcPr>
+          <w:p>
+            <w:pPr>
+              <w:spacing w:after="0"/>
+            </w:pPr>
+            <w:r/>
+            <w:r>
+              <w:rPr>
+                <w:rFonts w:ascii="Microsoft YaHei" w:hAnsi="Microsoft YaHei" w:eastAsia="Microsoft YaHei"/>
+                <w:b/>
+                <w:color w:val="1F4D78"/>
+                <w:sz w:val="19"/>
+              </w:rPr>
+              <w:t>第二数量（千克）</w:t>
+            </w:r>
+          </w:p>
+        </w:tc>
+      </w:tr>
+      <w:tr>
+        <w:tc>
+          <w:tcPr>
+            <w:tcW w:type="dxa" w:w="1200"/>
+            <w:vAlign w:val="center"/>
+          </w:tcPr>
+          <w:p>
+            <w:pPr>
+              <w:spacing w:after="0"/>
+            </w:pPr>
+            <w:r/>
+            <w:r>
+              <w:rPr>
+                <w:rFonts w:ascii="Microsoft YaHei" w:hAnsi="Microsoft YaHei" w:eastAsia="Microsoft YaHei"/>
+                <w:b w:val="0"/>
+                <w:color w:val="000000"/>
+                <w:sz w:val="19"/>
+              </w:rPr>
+              <w:t>2025-01</w:t>
+            </w:r>
+          </w:p>
+        </w:tc>
+        <w:tc>
+          <w:tcPr>
+            <w:tcW w:type="dxa" w:w="2200"/>
+            <w:vAlign w:val="center"/>
+          </w:tcPr>
+          <w:p>
+            <w:pPr>
+              <w:spacing w:after="0"/>
+            </w:pPr>
+            <w:r/>
+            <w:r>
+              <w:rPr>
+                <w:rFonts w:ascii="Microsoft YaHei" w:hAnsi="Microsoft YaHei" w:eastAsia="Microsoft YaHei"/>
+                <w:b w:val="0"/>
+                <w:color w:val="000000"/>
+                <w:sz w:val="19"/>
+              </w:rPr>
+              <w:t>1.61 十亿元人民币</w:t>
+            </w:r>
+          </w:p>
+        </w:tc>
+        <w:tc>
+          <w:tcPr>
+            <w:tcW w:type="dxa" w:w="2880"/>
+            <w:vAlign w:val="center"/>
+          </w:tcPr>
+          <w:p>
+            <w:pPr>
+              <w:spacing w:after="0"/>
+            </w:pPr>
+            <w:r/>
+            <w:r>
+              <w:rPr>
+                <w:rFonts w:ascii="Microsoft YaHei" w:hAnsi="Microsoft YaHei" w:eastAsia="Microsoft YaHei"/>
+                <w:b w:val="0"/>
+                <w:color w:val="000000"/>
+                <w:sz w:val="19"/>
+              </w:rPr>
+              <w:t>66,779,210</w:t>
+            </w:r>
+          </w:p>
+        </w:tc>
+        <w:tc>
+          <w:tcPr>
+            <w:tcW w:type="dxa" w:w="3080"/>
+            <w:vAlign w:val="center"/>
+          </w:tcPr>
+          <w:p>
+            <w:pPr>
+              <w:spacing w:after="0"/>
+            </w:pPr>
+            <w:r/>
+            <w:r>
+              <w:rPr>
+                <w:rFonts w:ascii="Microsoft YaHei" w:hAnsi="Microsoft YaHei" w:eastAsia="Microsoft YaHei"/>
+                <w:b w:val="0"/>
+                <w:color w:val="000000"/>
+                <w:sz w:val="19"/>
+              </w:rPr>
+              <w:t>14,675,160</w:t>
+            </w:r>
+          </w:p>
+        </w:tc>
+      </w:tr>
+      <w:tr>
+        <w:tc>
+          <w:tcPr>
+            <w:tcW w:type="dxa" w:w="1200"/>
+            <w:vAlign w:val="center"/>
+          </w:tcPr>
+          <w:p>
+            <w:pPr>
+              <w:spacing w:after="0"/>
+            </w:pPr>
+            <w:r/>
+            <w:r>
+              <w:rPr>
+                <w:rFonts w:ascii="Microsoft YaHei" w:hAnsi="Microsoft YaHei" w:eastAsia="Microsoft YaHei"/>
+                <w:b w:val="0"/>
+                <w:color w:val="000000"/>
+                <w:sz w:val="19"/>
+              </w:rPr>
+              <w:t>2025-02</w:t>
+            </w:r>
+          </w:p>
+        </w:tc>
+        <w:tc>
+          <w:tcPr>
+            <w:tcW w:type="dxa" w:w="2200"/>
+            <w:vAlign w:val="center"/>
+          </w:tcPr>
+          <w:p>
+            <w:pPr>
+              <w:spacing w:after="0"/>
+            </w:pPr>
+            <w:r/>
+            <w:r>
+              <w:rPr>
+                <w:rFonts w:ascii="Microsoft YaHei" w:hAnsi="Microsoft YaHei" w:eastAsia="Microsoft YaHei"/>
+                <w:b w:val="0"/>
+                <w:color w:val="000000"/>
+                <w:sz w:val="19"/>
+              </w:rPr>
+              <w:t>1.55 十亿元人民币</w:t>
+            </w:r>
+          </w:p>
+        </w:tc>
+        <w:tc>
+          <w:tcPr>
+            <w:tcW w:type="dxa" w:w="2880"/>
+            <w:vAlign w:val="center"/>
+          </w:tcPr>
+          <w:p>
+            <w:pPr>
+              <w:spacing w:after="0"/>
+            </w:pPr>
+            <w:r/>
+            <w:r>
+              <w:rPr>
+                <w:rFonts w:ascii="Microsoft YaHei" w:hAnsi="Microsoft YaHei" w:eastAsia="Microsoft YaHei"/>
+                <w:b w:val="0"/>
+                <w:color w:val="000000"/>
+                <w:sz w:val="19"/>
+              </w:rPr>
+              <w:t>49,889,509</w:t>
+            </w:r>
+          </w:p>
+        </w:tc>
+        <w:tc>
+          <w:tcPr>
+            <w:tcW w:type="dxa" w:w="3080"/>
+            <w:vAlign w:val="center"/>
+          </w:tcPr>
+          <w:p>
+            <w:pPr>
+              <w:spacing w:after="0"/>
+            </w:pPr>
+            <w:r/>
+            <w:r>
+              <w:rPr>
+                <w:rFonts w:ascii="Microsoft YaHei" w:hAnsi="Microsoft YaHei" w:eastAsia="Microsoft YaHei"/>
+                <w:b w:val="0"/>
+                <w:color w:val="000000"/>
+                <w:sz w:val="19"/>
+              </w:rPr>
+              <w:t>12,888,861</w:t>
+            </w:r>
+          </w:p>
+        </w:tc>
+      </w:tr>
+      <w:tr>
+        <w:tc>
+          <w:tcPr>
+            <w:tcW w:type="dxa" w:w="1200"/>
+            <w:vAlign w:val="center"/>
+          </w:tcPr>
+          <w:p>
+            <w:pPr>
+              <w:spacing w:after="0"/>
+            </w:pPr>
+            <w:r/>
+            <w:r>
+              <w:rPr>
+                <w:rFonts w:ascii="Microsoft YaHei" w:hAnsi="Microsoft YaHei" w:eastAsia="Microsoft YaHei"/>
+                <w:b w:val="0"/>
+                <w:color w:val="000000"/>
+                <w:sz w:val="19"/>
+              </w:rPr>
+              <w:t>2025-03</w:t>
+            </w:r>
+          </w:p>
+        </w:tc>
+        <w:tc>
+          <w:tcPr>
+            <w:tcW w:type="dxa" w:w="2200"/>
+            <w:vAlign w:val="center"/>
+          </w:tcPr>
+          <w:p>
+            <w:pPr>
+              <w:spacing w:after="0"/>
+            </w:pPr>
+            <w:r/>
+            <w:r>
+              <w:rPr>
+                <w:rFonts w:ascii="Microsoft YaHei" w:hAnsi="Microsoft YaHei" w:eastAsia="Microsoft YaHei"/>
+                <w:b w:val="0"/>
+                <w:color w:val="000000"/>
+                <w:sz w:val="19"/>
+              </w:rPr>
+              <w:t>2.07 十亿元人民币</w:t>
+            </w:r>
+          </w:p>
+        </w:tc>
+        <w:tc>
+          <w:tcPr>
+            <w:tcW w:type="dxa" w:w="2880"/>
+            <w:vAlign w:val="center"/>
+          </w:tcPr>
+          <w:p>
+            <w:pPr>
+              <w:spacing w:after="0"/>
+            </w:pPr>
+            <w:r/>
+            <w:r>
+              <w:rPr>
+                <w:rFonts w:ascii="Microsoft YaHei" w:hAnsi="Microsoft YaHei" w:eastAsia="Microsoft YaHei"/>
+                <w:b w:val="0"/>
+                <w:color w:val="000000"/>
+                <w:sz w:val="19"/>
+              </w:rPr>
+              <w:t>72,147,598</w:t>
+            </w:r>
+          </w:p>
+        </w:tc>
+        <w:tc>
+          <w:tcPr>
+            <w:tcW w:type="dxa" w:w="3080"/>
+            <w:vAlign w:val="center"/>
+          </w:tcPr>
+          <w:p>
+            <w:pPr>
+              <w:spacing w:after="0"/>
+            </w:pPr>
+            <w:r/>
+            <w:r>
+              <w:rPr>
+                <w:rFonts w:ascii="Microsoft YaHei" w:hAnsi="Microsoft YaHei" w:eastAsia="Microsoft YaHei"/>
+                <w:b w:val="0"/>
+                <w:color w:val="000000"/>
+                <w:sz w:val="19"/>
+              </w:rPr>
+              <w:t>17,947,948</w:t>
+            </w:r>
+          </w:p>
+        </w:tc>
+      </w:tr>
+      <w:tr>
+        <w:tc>
+          <w:tcPr>
+            <w:tcW w:type="dxa" w:w="1200"/>
+            <w:vAlign w:val="center"/>
+          </w:tcPr>
+          <w:p>
+            <w:pPr>
+              <w:spacing w:after="0"/>
+            </w:pPr>
+            <w:r/>
+            <w:r>
+              <w:rPr>
+                <w:rFonts w:ascii="Microsoft YaHei" w:hAnsi="Microsoft YaHei" w:eastAsia="Microsoft YaHei"/>
+                <w:b w:val="0"/>
+                <w:color w:val="000000"/>
+                <w:sz w:val="19"/>
+              </w:rPr>
+              <w:t>2025-04</w:t>
+            </w:r>
+          </w:p>
+        </w:tc>
+        <w:tc>
+          <w:tcPr>
+            <w:tcW w:type="dxa" w:w="2200"/>
+            <w:vAlign w:val="center"/>
+          </w:tcPr>
+          <w:p>
+            <w:pPr>
+              <w:spacing w:after="0"/>
+            </w:pPr>
+            <w:r/>
+            <w:r>
+              <w:rPr>
+                <w:rFonts w:ascii="Microsoft YaHei" w:hAnsi="Microsoft YaHei" w:eastAsia="Microsoft YaHei"/>
+                <w:b w:val="0"/>
+                <w:color w:val="000000"/>
+                <w:sz w:val="19"/>
+              </w:rPr>
+              <w:t>1.84 十亿元人民币</w:t>
+            </w:r>
+          </w:p>
+        </w:tc>
+        <w:tc>
+          <w:tcPr>
+            <w:tcW w:type="dxa" w:w="2880"/>
+            <w:vAlign w:val="center"/>
+          </w:tcPr>
+          <w:p>
+            <w:pPr>
+              <w:spacing w:after="0"/>
+            </w:pPr>
+            <w:r/>
+            <w:r>
+              <w:rPr>
+                <w:rFonts w:ascii="Microsoft YaHei" w:hAnsi="Microsoft YaHei" w:eastAsia="Microsoft YaHei"/>
+                <w:b w:val="0"/>
+                <w:color w:val="000000"/>
+                <w:sz w:val="19"/>
+              </w:rPr>
+              <w:t>70,255,926</w:t>
+            </w:r>
+          </w:p>
+        </w:tc>
+        <w:tc>
+          <w:tcPr>
+            <w:tcW w:type="dxa" w:w="3080"/>
+            <w:vAlign w:val="center"/>
+          </w:tcPr>
+          <w:p>
+            <w:pPr>
+              <w:spacing w:after="0"/>
+            </w:pPr>
+            <w:r/>
+            <w:r>
+              <w:rPr>
+                <w:rFonts w:ascii="Microsoft YaHei" w:hAnsi="Microsoft YaHei" w:eastAsia="Microsoft YaHei"/>
+                <w:b w:val="0"/>
+                <w:color w:val="000000"/>
+                <w:sz w:val="19"/>
+              </w:rPr>
+              <w:t>15,358,859</w:t>
+            </w:r>
+          </w:p>
+        </w:tc>
+      </w:tr>
+      <w:tr>
+        <w:tc>
+          <w:tcPr>
+            <w:tcW w:type="dxa" w:w="1200"/>
+            <w:vAlign w:val="center"/>
+          </w:tcPr>
+          <w:p>
+            <w:pPr>
+              <w:spacing w:after="0"/>
+            </w:pPr>
+            <w:r/>
+            <w:r>
+              <w:rPr>
+                <w:rFonts w:ascii="Microsoft YaHei" w:hAnsi="Microsoft YaHei" w:eastAsia="Microsoft YaHei"/>
+                <w:b w:val="0"/>
+                <w:color w:val="000000"/>
+                <w:sz w:val="19"/>
+              </w:rPr>
+              <w:t>2025-05</w:t>
+            </w:r>
+          </w:p>
+        </w:tc>
+        <w:tc>
+          <w:tcPr>
+            <w:tcW w:type="dxa" w:w="2200"/>
+            <w:vAlign w:val="center"/>
+          </w:tcPr>
+          <w:p>
+            <w:pPr>
+              <w:spacing w:after="0"/>
+            </w:pPr>
+            <w:r/>
+            <w:r>
+              <w:rPr>
+                <w:rFonts w:ascii="Microsoft YaHei" w:hAnsi="Microsoft YaHei" w:eastAsia="Microsoft YaHei"/>
+                <w:b w:val="0"/>
+                <w:color w:val="000000"/>
+                <w:sz w:val="19"/>
+              </w:rPr>
+              <w:t>2.03 十亿元人民币</w:t>
+            </w:r>
+          </w:p>
+        </w:tc>
+        <w:tc>
+          <w:tcPr>
+            <w:tcW w:type="dxa" w:w="2880"/>
+            <w:vAlign w:val="center"/>
+          </w:tcPr>
+          <w:p>
+            <w:pPr>
+              <w:spacing w:after="0"/>
+            </w:pPr>
+            <w:r/>
+            <w:r>
+              <w:rPr>
+                <w:rFonts w:ascii="Microsoft YaHei" w:hAnsi="Microsoft YaHei" w:eastAsia="Microsoft YaHei"/>
+                <w:b w:val="0"/>
+                <w:color w:val="000000"/>
+                <w:sz w:val="19"/>
+              </w:rPr>
+              <w:t>79,993,514</w:t>
+            </w:r>
+          </w:p>
+        </w:tc>
+        <w:tc>
+          <w:tcPr>
+            <w:tcW w:type="dxa" w:w="3080"/>
+            <w:vAlign w:val="center"/>
+          </w:tcPr>
+          <w:p>
+            <w:pPr>
+              <w:spacing w:after="0"/>
+            </w:pPr>
+            <w:r/>
+            <w:r>
+              <w:rPr>
+                <w:rFonts w:ascii="Microsoft YaHei" w:hAnsi="Microsoft YaHei" w:eastAsia="Microsoft YaHei"/>
+                <w:b w:val="0"/>
+                <w:color w:val="000000"/>
+                <w:sz w:val="19"/>
+              </w:rPr>
+              <w:t>17,883,397</w:t>
+            </w:r>
+          </w:p>
+        </w:tc>
+      </w:tr>
+      <w:tr>
+        <w:tc>
+          <w:tcPr>
+            <w:tcW w:type="dxa" w:w="1200"/>
+            <w:vAlign w:val="center"/>
+          </w:tcPr>
+          <w:p>
+            <w:pPr>
+              <w:spacing w:after="0"/>
+            </w:pPr>
+            <w:r/>
+            <w:r>
+              <w:rPr>
+                <w:rFonts w:ascii="Microsoft YaHei" w:hAnsi="Microsoft YaHei" w:eastAsia="Microsoft YaHei"/>
+                <w:b w:val="0"/>
+                <w:color w:val="000000"/>
+                <w:sz w:val="19"/>
+              </w:rPr>
+              <w:t>2025-06</w:t>
+            </w:r>
+          </w:p>
+        </w:tc>
+        <w:tc>
+          <w:tcPr>
+            <w:tcW w:type="dxa" w:w="2200"/>
+            <w:vAlign w:val="center"/>
+          </w:tcPr>
+          <w:p>
+            <w:pPr>
+              <w:spacing w:after="0"/>
+            </w:pPr>
+            <w:r/>
+            <w:r>
+              <w:rPr>
+                <w:rFonts w:ascii="Microsoft YaHei" w:hAnsi="Microsoft YaHei" w:eastAsia="Microsoft YaHei"/>
+                <w:b w:val="0"/>
+                <w:color w:val="000000"/>
+                <w:sz w:val="19"/>
+              </w:rPr>
+              <w:t>1.87 十亿元人民币</w:t>
+            </w:r>
+          </w:p>
+        </w:tc>
+        <w:tc>
+          <w:tcPr>
+            <w:tcW w:type="dxa" w:w="2880"/>
+            <w:vAlign w:val="center"/>
+          </w:tcPr>
+          <w:p>
+            <w:pPr>
+              <w:spacing w:after="0"/>
+            </w:pPr>
+            <w:r/>
+            <w:r>
+              <w:rPr>
+                <w:rFonts w:ascii="Microsoft YaHei" w:hAnsi="Microsoft YaHei" w:eastAsia="Microsoft YaHei"/>
+                <w:b w:val="0"/>
+                <w:color w:val="000000"/>
+                <w:sz w:val="19"/>
+              </w:rPr>
+              <w:t>83,785,937</w:t>
+            </w:r>
+          </w:p>
+        </w:tc>
+        <w:tc>
+          <w:tcPr>
+            <w:tcW w:type="dxa" w:w="3080"/>
+            <w:vAlign w:val="center"/>
+          </w:tcPr>
+          <w:p>
+            <w:pPr>
+              <w:spacing w:after="0"/>
+            </w:pPr>
+            <w:r/>
+            <w:r>
+              <w:rPr>
+                <w:rFonts w:ascii="Microsoft YaHei" w:hAnsi="Microsoft YaHei" w:eastAsia="Microsoft YaHei"/>
+                <w:b w:val="0"/>
+                <w:color w:val="000000"/>
+                <w:sz w:val="19"/>
+              </w:rPr>
+              <w:t>18,255,551</w:t>
+            </w:r>
+          </w:p>
+        </w:tc>
+      </w:tr>
+      <w:tr>
+        <w:tc>
+          <w:tcPr>
+            <w:tcW w:type="dxa" w:w="1200"/>
+            <w:vAlign w:val="center"/>
+          </w:tcPr>
+          <w:p>
+            <w:pPr>
+              <w:spacing w:after="0"/>
+            </w:pPr>
+            <w:r/>
+            <w:r>
+              <w:rPr>
+                <w:rFonts w:ascii="Microsoft YaHei" w:hAnsi="Microsoft YaHei" w:eastAsia="Microsoft YaHei"/>
+                <w:b w:val="0"/>
+                <w:color w:val="000000"/>
+                <w:sz w:val="19"/>
+              </w:rPr>
+              <w:t>2025-07</w:t>
+            </w:r>
+          </w:p>
+        </w:tc>
+        <w:tc>
+          <w:tcPr>
+            <w:tcW w:type="dxa" w:w="2200"/>
+            <w:vAlign w:val="center"/>
+          </w:tcPr>
+          <w:p>
+            <w:pPr>
+              <w:spacing w:after="0"/>
+            </w:pPr>
+            <w:r/>
+            <w:r>
+              <w:rPr>
+                <w:rFonts w:ascii="Microsoft YaHei" w:hAnsi="Microsoft YaHei" w:eastAsia="Microsoft YaHei"/>
+                <w:b w:val="0"/>
+                <w:color w:val="000000"/>
+                <w:sz w:val="19"/>
+              </w:rPr>
+              <w:t>2.02 十亿元人民币</w:t>
+            </w:r>
+          </w:p>
+        </w:tc>
+        <w:tc>
+          <w:tcPr>
+            <w:tcW w:type="dxa" w:w="2880"/>
+            <w:vAlign w:val="center"/>
+          </w:tcPr>
+          <w:p>
+            <w:pPr>
+              <w:spacing w:after="0"/>
+            </w:pPr>
+            <w:r/>
+            <w:r>
+              <w:rPr>
+                <w:rFonts w:ascii="Microsoft YaHei" w:hAnsi="Microsoft YaHei" w:eastAsia="Microsoft YaHei"/>
+                <w:b w:val="0"/>
+                <w:color w:val="000000"/>
+                <w:sz w:val="19"/>
+              </w:rPr>
+              <w:t>91,268,101</w:t>
+            </w:r>
+          </w:p>
+        </w:tc>
+        <w:tc>
+          <w:tcPr>
+            <w:tcW w:type="dxa" w:w="3080"/>
+            <w:vAlign w:val="center"/>
+          </w:tcPr>
+          <w:p>
+            <w:pPr>
+              <w:spacing w:after="0"/>
+            </w:pPr>
+            <w:r/>
+            <w:r>
+              <w:rPr>
+                <w:rFonts w:ascii="Microsoft YaHei" w:hAnsi="Microsoft YaHei" w:eastAsia="Microsoft YaHei"/>
+                <w:b w:val="0"/>
+                <w:color w:val="000000"/>
+                <w:sz w:val="19"/>
+              </w:rPr>
+              <w:t>19,167,252</w:t>
+            </w:r>
+          </w:p>
+        </w:tc>
+      </w:tr>
+      <w:tr>
+        <w:tc>
+          <w:tcPr>
+            <w:tcW w:type="dxa" w:w="1200"/>
+            <w:vAlign w:val="center"/>
+          </w:tcPr>
+          <w:p>
+            <w:pPr>
+              <w:spacing w:after="0"/>
+            </w:pPr>
+            <w:r/>
+            <w:r>
+              <w:rPr>
+                <w:rFonts w:ascii="Microsoft YaHei" w:hAnsi="Microsoft YaHei" w:eastAsia="Microsoft YaHei"/>
+                <w:b w:val="0"/>
+                <w:color w:val="000000"/>
+                <w:sz w:val="19"/>
+              </w:rPr>
+              <w:t>2025-08</w:t>
+            </w:r>
+          </w:p>
+        </w:tc>
+        <w:tc>
+          <w:tcPr>
+            <w:tcW w:type="dxa" w:w="2200"/>
+            <w:vAlign w:val="center"/>
+          </w:tcPr>
+          <w:p>
+            <w:pPr>
+              <w:spacing w:after="0"/>
+            </w:pPr>
+            <w:r/>
+            <w:r>
+              <w:rPr>
+                <w:rFonts w:ascii="Microsoft YaHei" w:hAnsi="Microsoft YaHei" w:eastAsia="Microsoft YaHei"/>
+                <w:b w:val="0"/>
+                <w:color w:val="000000"/>
+                <w:sz w:val="19"/>
+              </w:rPr>
+              <w:t>2.77 十亿元人民币</w:t>
+            </w:r>
+          </w:p>
+        </w:tc>
+        <w:tc>
+          <w:tcPr>
+            <w:tcW w:type="dxa" w:w="2880"/>
+            <w:vAlign w:val="center"/>
+          </w:tcPr>
+          <w:p>
+            <w:pPr>
+              <w:spacing w:after="0"/>
+            </w:pPr>
+            <w:r/>
+            <w:r>
+              <w:rPr>
+                <w:rFonts w:ascii="Microsoft YaHei" w:hAnsi="Microsoft YaHei" w:eastAsia="Microsoft YaHei"/>
+                <w:b w:val="0"/>
+                <w:color w:val="000000"/>
+                <w:sz w:val="19"/>
+              </w:rPr>
+              <w:t>98,691,261</w:t>
+            </w:r>
+          </w:p>
+        </w:tc>
+        <w:tc>
+          <w:tcPr>
+            <w:tcW w:type="dxa" w:w="3080"/>
+            <w:vAlign w:val="center"/>
+          </w:tcPr>
+          <w:p>
+            <w:pPr>
+              <w:spacing w:after="0"/>
+            </w:pPr>
+            <w:r/>
+            <w:r>
+              <w:rPr>
+                <w:rFonts w:ascii="Microsoft YaHei" w:hAnsi="Microsoft YaHei" w:eastAsia="Microsoft YaHei"/>
+                <w:b w:val="0"/>
+                <w:color w:val="000000"/>
+                <w:sz w:val="19"/>
+              </w:rPr>
+              <w:t>28,637,244</w:t>
+            </w:r>
+          </w:p>
+        </w:tc>
+      </w:tr>
+      <w:tr>
+        <w:tc>
+          <w:tcPr>
+            <w:tcW w:type="dxa" w:w="1200"/>
+            <w:vAlign w:val="center"/>
+          </w:tcPr>
+          <w:p>
+            <w:pPr>
+              <w:spacing w:after="0"/>
+            </w:pPr>
+            <w:r/>
+            <w:r>
+              <w:rPr>
+                <w:rFonts w:ascii="Microsoft YaHei" w:hAnsi="Microsoft YaHei" w:eastAsia="Microsoft YaHei"/>
+                <w:b w:val="0"/>
+                <w:color w:val="000000"/>
+                <w:sz w:val="19"/>
+              </w:rPr>
+              <w:t>2025-09</w:t>
+            </w:r>
+          </w:p>
+        </w:tc>
+        <w:tc>
+          <w:tcPr>
+            <w:tcW w:type="dxa" w:w="2200"/>
+            <w:vAlign w:val="center"/>
+          </w:tcPr>
+          <w:p>
+            <w:pPr>
+              <w:spacing w:after="0"/>
+            </w:pPr>
+            <w:r/>
+            <w:r>
+              <w:rPr>
+                <w:rFonts w:ascii="Microsoft YaHei" w:hAnsi="Microsoft YaHei" w:eastAsia="Microsoft YaHei"/>
+                <w:b w:val="0"/>
+                <w:color w:val="000000"/>
+                <w:sz w:val="19"/>
+              </w:rPr>
+              <w:t>2.12 十亿元人民币</w:t>
+            </w:r>
+          </w:p>
+        </w:tc>
+        <w:tc>
+          <w:tcPr>
+            <w:tcW w:type="dxa" w:w="2880"/>
+            <w:vAlign w:val="center"/>
+          </w:tcPr>
+          <w:p>
+            <w:pPr>
+              <w:spacing w:after="0"/>
+            </w:pPr>
+            <w:r/>
+            <w:r>
+              <w:rPr>
+                <w:rFonts w:ascii="Microsoft YaHei" w:hAnsi="Microsoft YaHei" w:eastAsia="Microsoft YaHei"/>
+                <w:b w:val="0"/>
+                <w:color w:val="000000"/>
+                <w:sz w:val="19"/>
+              </w:rPr>
+              <w:t>94,713,998</w:t>
+            </w:r>
+          </w:p>
+        </w:tc>
+        <w:tc>
+          <w:tcPr>
+            <w:tcW w:type="dxa" w:w="3080"/>
+            <w:vAlign w:val="center"/>
+          </w:tcPr>
+          <w:p>
+            <w:pPr>
+              <w:spacing w:after="0"/>
+            </w:pPr>
+            <w:r/>
+            <w:r>
+              <w:rPr>
+                <w:rFonts w:ascii="Microsoft YaHei" w:hAnsi="Microsoft YaHei" w:eastAsia="Microsoft YaHei"/>
+                <w:b w:val="0"/>
+                <w:color w:val="000000"/>
+                <w:sz w:val="19"/>
+              </w:rPr>
+              <w:t>22,310,739</w:t>
+            </w:r>
+          </w:p>
+        </w:tc>
+      </w:tr>
+      <w:tr>
+        <w:tc>
+          <w:tcPr>
+            <w:tcW w:type="dxa" w:w="1200"/>
+            <w:vAlign w:val="center"/>
+          </w:tcPr>
+          <w:p>
+            <w:pPr>
+              <w:spacing w:after="0"/>
+            </w:pPr>
+            <w:r/>
+            <w:r>
+              <w:rPr>
+                <w:rFonts w:ascii="Microsoft YaHei" w:hAnsi="Microsoft YaHei" w:eastAsia="Microsoft YaHei"/>
+                <w:b w:val="0"/>
+                <w:color w:val="000000"/>
+                <w:sz w:val="19"/>
+              </w:rPr>
+              <w:t>2025-10</w:t>
+            </w:r>
+          </w:p>
+        </w:tc>
+        <w:tc>
+          <w:tcPr>
+            <w:tcW w:type="dxa" w:w="2200"/>
+            <w:vAlign w:val="center"/>
+          </w:tcPr>
+          <w:p>
+            <w:pPr>
+              <w:spacing w:after="0"/>
+            </w:pPr>
+            <w:r/>
+            <w:r>
+              <w:rPr>
+                <w:rFonts w:ascii="Microsoft YaHei" w:hAnsi="Microsoft YaHei" w:eastAsia="Microsoft YaHei"/>
+                <w:b w:val="0"/>
+                <w:color w:val="000000"/>
+                <w:sz w:val="19"/>
+              </w:rPr>
+              <w:t>2.28 十亿元人民币</w:t>
+            </w:r>
+          </w:p>
+        </w:tc>
+        <w:tc>
+          <w:tcPr>
+            <w:tcW w:type="dxa" w:w="2880"/>
+            <w:vAlign w:val="center"/>
+          </w:tcPr>
+          <w:p>
+            <w:pPr>
+              <w:spacing w:after="0"/>
+            </w:pPr>
+            <w:r/>
+            <w:r>
+              <w:rPr>
+                <w:rFonts w:ascii="Microsoft YaHei" w:hAnsi="Microsoft YaHei" w:eastAsia="Microsoft YaHei"/>
+                <w:b w:val="0"/>
+                <w:color w:val="000000"/>
+                <w:sz w:val="19"/>
+              </w:rPr>
+              <w:t>83,962,940</w:t>
+            </w:r>
+          </w:p>
+        </w:tc>
+        <w:tc>
+          <w:tcPr>
+            <w:tcW w:type="dxa" w:w="3080"/>
+            <w:vAlign w:val="center"/>
+          </w:tcPr>
+          <w:p>
+            <w:pPr>
+              <w:spacing w:after="0"/>
+            </w:pPr>
+            <w:r/>
+            <w:r>
+              <w:rPr>
+                <w:rFonts w:ascii="Microsoft YaHei" w:hAnsi="Microsoft YaHei" w:eastAsia="Microsoft YaHei"/>
+                <w:b w:val="0"/>
+                <w:color w:val="000000"/>
+                <w:sz w:val="19"/>
+              </w:rPr>
+              <w:t>22,605,448</w:t>
+            </w:r>
+          </w:p>
+        </w:tc>
+      </w:tr>
+      <w:tr>
+        <w:tc>
+          <w:tcPr>
+            <w:tcW w:type="dxa" w:w="1200"/>
+            <w:vAlign w:val="center"/>
+          </w:tcPr>
+          <w:p>
+            <w:pPr>
+              <w:spacing w:after="0"/>
+            </w:pPr>
+            <w:r/>
+            <w:r>
+              <w:rPr>
+                <w:rFonts w:ascii="Microsoft YaHei" w:hAnsi="Microsoft YaHei" w:eastAsia="Microsoft YaHei"/>
+                <w:b w:val="0"/>
+                <w:color w:val="000000"/>
+                <w:sz w:val="19"/>
+              </w:rPr>
+              <w:t>2025-11</w:t>
+            </w:r>
+          </w:p>
+        </w:tc>
+        <w:tc>
+          <w:tcPr>
+            <w:tcW w:type="dxa" w:w="2200"/>
+            <w:vAlign w:val="center"/>
+          </w:tcPr>
+          <w:p>
+            <w:pPr>
+              <w:spacing w:after="0"/>
+            </w:pPr>
+            <w:r/>
+            <w:r>
+              <w:rPr>
+                <w:rFonts w:ascii="Microsoft YaHei" w:hAnsi="Microsoft YaHei" w:eastAsia="Microsoft YaHei"/>
+                <w:b w:val="0"/>
+                <w:color w:val="000000"/>
+                <w:sz w:val="19"/>
+              </w:rPr>
+              <w:t>2.52 十亿元人民币</w:t>
+            </w:r>
+          </w:p>
+        </w:tc>
+        <w:tc>
+          <w:tcPr>
+            <w:tcW w:type="dxa" w:w="2880"/>
+            <w:vAlign w:val="center"/>
+          </w:tcPr>
+          <w:p>
+            <w:pPr>
+              <w:spacing w:after="0"/>
+            </w:pPr>
+            <w:r/>
+            <w:r>
+              <w:rPr>
+                <w:rFonts w:ascii="Microsoft YaHei" w:hAnsi="Microsoft YaHei" w:eastAsia="Microsoft YaHei"/>
+                <w:b w:val="0"/>
+                <w:color w:val="000000"/>
+                <w:sz w:val="19"/>
+              </w:rPr>
+              <w:t>100,860,554</w:t>
+            </w:r>
+          </w:p>
+        </w:tc>
+        <w:tc>
+          <w:tcPr>
+            <w:tcW w:type="dxa" w:w="3080"/>
+            <w:vAlign w:val="center"/>
+          </w:tcPr>
+          <w:p>
+            <w:pPr>
+              <w:spacing w:after="0"/>
+            </w:pPr>
+            <w:r/>
+            <w:r>
+              <w:rPr>
+                <w:rFonts w:ascii="Microsoft YaHei" w:hAnsi="Microsoft YaHei" w:eastAsia="Microsoft YaHei"/>
+                <w:b w:val="0"/>
+                <w:color w:val="000000"/>
+                <w:sz w:val="19"/>
+              </w:rPr>
+              <w:t>26,302,863</w:t>
+            </w:r>
+          </w:p>
+        </w:tc>
+      </w:tr>
+      <w:tr>
+        <w:tc>
+          <w:tcPr>
+            <w:tcW w:type="dxa" w:w="1200"/>
+            <w:vAlign w:val="center"/>
+          </w:tcPr>
+          <w:p>
+            <w:pPr>
+              <w:spacing w:after="0"/>
+            </w:pPr>
+            <w:r/>
+            <w:r>
+              <w:rPr>
+                <w:rFonts w:ascii="Microsoft YaHei" w:hAnsi="Microsoft YaHei" w:eastAsia="Microsoft YaHei"/>
+                <w:b w:val="0"/>
+                <w:color w:val="000000"/>
+                <w:sz w:val="19"/>
+              </w:rPr>
+              <w:t>2025-12</w:t>
+            </w:r>
+          </w:p>
+        </w:tc>
+        <w:tc>
+          <w:tcPr>
+            <w:tcW w:type="dxa" w:w="2200"/>
+            <w:vAlign w:val="center"/>
+          </w:tcPr>
+          <w:p>
+            <w:pPr>
+              <w:spacing w:after="0"/>
+            </w:pPr>
+            <w:r/>
+            <w:r>
+              <w:rPr>
+                <w:rFonts w:ascii="Microsoft YaHei" w:hAnsi="Microsoft YaHei" w:eastAsia="Microsoft YaHei"/>
+                <w:b w:val="0"/>
+                <w:color w:val="000000"/>
+                <w:sz w:val="19"/>
+              </w:rPr>
+              <w:t>4.16 十亿元人民币</w:t>
+            </w:r>
+          </w:p>
+        </w:tc>
+        <w:tc>
+          <w:tcPr>
+            <w:tcW w:type="dxa" w:w="2880"/>
+            <w:vAlign w:val="center"/>
+          </w:tcPr>
+          <w:p>
+            <w:pPr>
+              <w:spacing w:after="0"/>
+            </w:pPr>
+            <w:r/>
+            <w:r>
+              <w:rPr>
+                <w:rFonts w:ascii="Microsoft YaHei" w:hAnsi="Microsoft YaHei" w:eastAsia="Microsoft YaHei"/>
+                <w:b w:val="0"/>
+                <w:color w:val="000000"/>
+                <w:sz w:val="19"/>
+              </w:rPr>
+              <w:t>97,226,305</w:t>
+            </w:r>
+          </w:p>
+        </w:tc>
+        <w:tc>
+          <w:tcPr>
+            <w:tcW w:type="dxa" w:w="3080"/>
+            <w:vAlign w:val="center"/>
+          </w:tcPr>
+          <w:p>
+            <w:pPr>
+              <w:spacing w:after="0"/>
+            </w:pPr>
+            <w:r/>
+            <w:r>
+              <w:rPr>
+                <w:rFonts w:ascii="Microsoft YaHei" w:hAnsi="Microsoft YaHei" w:eastAsia="Microsoft YaHei"/>
+                <w:b w:val="0"/>
+                <w:color w:val="000000"/>
+                <w:sz w:val="19"/>
+              </w:rPr>
+              <w:t>59,244,028</w:t>
+            </w:r>
+          </w:p>
+        </w:tc>
+      </w:tr>
+    </w:tbl>
+    <w:p>
+      <w:r>
+        <w:t>结构补充：一般贸易占 78.31%，进料加工贸易占 19.50%；2025 年12月出口额为 41.56 亿元，为年内最高值。</w:t>
+      </w:r>
+    </w:p>
+    <w:p>
+      <w:pPr>
         <w:pStyle w:val="Heading1"/>
       </w:pPr>
       <w:r>
@@ -535,6 +1705,19 @@
           <w:sz w:val="21"/>
         </w:rPr>
         <w:t>中国商务部、海关总署及中国出口管制信息网：现行两用物项清单、公告与许可证管理目录。</w:t>
+      </w:r>
+    </w:p>
+    <w:p>
+      <w:pPr>
+        <w:pStyle w:val="ListBullet"/>
+        <w:spacing w:after="80"/>
+      </w:pPr>
+      <w:r>
+        <w:rPr>
+          <w:rFonts w:ascii="Microsoft YaHei" w:hAnsi="Microsoft YaHei" w:eastAsia="Microsoft YaHei"/>
+          <w:sz w:val="21"/>
+        </w:rPr>
+        <w:t>用户提供的中国海关出口明细（锂离子蓄电池.csv）：HS8 85076000、中国出口至印度、2025-01—2025-12，币种人民币；访问 2026-07-24。</w:t>
       </w:r>
     </w:p>
     <w:p>

</xml_diff>

<commit_message>
Update supply atlas UI and evidence modules
</commit_message>
<xml_diff>
--- a/public/reports/battery.docx
+++ b/public/reports/battery.docx
@@ -360,7 +360,7 @@
           <w:rFonts w:ascii="Microsoft YaHei" w:hAnsi="Microsoft YaHei" w:eastAsia="Microsoft YaHei"/>
           <w:sz w:val="21"/>
         </w:rPr>
-        <w:t>蓄电池是样本中对华来源占比最高的商品。越南具备最强的第三国路径上限证据，香港、印度尼西亚、日本、马来西亚和韩国为次级节点，但必须区分电芯、模组与 PACK 的实质加工。</w:t>
+        <w:t>蓄电池是样本中对华来源占比最高的商品。印度政府议会答复已明确提示新能源汽车制造商对中国中游加工能力、先进电池和正负极材料存在供应链脆弱性；企业官方技术合作案例也显示印度本土电芯产能建设仍需引入中国电芯技术与关键材料供应链能力。越南、香港、印度尼西亚、日本、马来西亚和韩国仍作为第三国路径筛查节点，但必须区分电芯、模组与 PACK 的实质加工。</w:t>
       </w:r>
       <w:r>
         <w:rPr>
@@ -437,7 +437,7 @@
           <w:rFonts w:ascii="Microsoft YaHei" w:hAnsi="Microsoft YaHei" w:eastAsia="Microsoft YaHei"/>
           <w:sz w:val="21"/>
         </w:rPr>
-        <w:t>OEC 显示越南 2024 年对印度出口电池约 1.25 亿美元，同时自中国进口电池约 49.4 亿美元。</w:t>
+        <w:t>印度重工业部 2026 年 3 月 17 日议会书面答复指出，印度锂等关键矿产需求全部依赖进口，并明确提到中国高性能锂离子电池、正极材料、人造石墨负极材料及制造技术出口许可管理可能造成供应收紧。</w:t>
       </w:r>
       <w:r>
         <w:rPr>
@@ -460,6 +460,75 @@
           <w:rFonts w:ascii="Microsoft YaHei" w:hAnsi="Microsoft YaHei" w:eastAsia="Microsoft YaHei"/>
           <w:sz w:val="21"/>
         </w:rPr>
+        <w:t>Moneycontrol 根据印度商业与工业部数据分析称，2023—2024 财年中国占印度电池包进口额的 72.8%，电池包在印度关键矿产相关进口中占 68%。</w:t>
+      </w:r>
+      <w:r>
+        <w:rPr>
+          <w:rFonts w:ascii="Microsoft YaHei" w:hAnsi="Microsoft YaHei" w:eastAsia="Microsoft YaHei"/>
+          <w:b w:val="0"/>
+          <w:color w:val="1F4D78"/>
+          <w:sz w:val="16"/>
+          <w:vertAlign w:val="superscript"/>
+        </w:rPr>
+        <w:t>〔5〕</w:t>
+      </w:r>
+    </w:p>
+    <w:p>
+      <w:pPr>
+        <w:pStyle w:val="ListBullet"/>
+        <w:spacing w:after="80"/>
+      </w:pPr>
+      <w:r>
+        <w:rPr>
+          <w:rFonts w:ascii="Microsoft YaHei" w:hAnsi="Microsoft YaHei" w:eastAsia="Microsoft YaHei"/>
+          <w:sz w:val="21"/>
+        </w:rPr>
+        <w:t>Amara Raja Group 2024 年 6 月 24 日披露，其子公司与中国国轩高科子公司 GIB EnergyX 签署磷酸铁锂电芯技术许可协议，范围包括电芯技术知识产权、超级工厂建设支持、关键电池材料全球供应链整合和技术服务。</w:t>
+      </w:r>
+      <w:r>
+        <w:rPr>
+          <w:rFonts w:ascii="Microsoft YaHei" w:hAnsi="Microsoft YaHei" w:eastAsia="Microsoft YaHei"/>
+          <w:b w:val="0"/>
+          <w:color w:val="1F4D78"/>
+          <w:sz w:val="16"/>
+          <w:vertAlign w:val="superscript"/>
+        </w:rPr>
+        <w:t>〔6〕</w:t>
+      </w:r>
+    </w:p>
+    <w:p>
+      <w:pPr>
+        <w:pStyle w:val="ListBullet"/>
+        <w:spacing w:after="80"/>
+      </w:pPr>
+      <w:r>
+        <w:rPr>
+          <w:rFonts w:ascii="Microsoft YaHei" w:hAnsi="Microsoft YaHei" w:eastAsia="Microsoft YaHei"/>
+          <w:sz w:val="21"/>
+        </w:rPr>
+        <w:t>OEC 显示越南 2024 年对印度出口电池约 1.25 亿美元，同时自中国进口电池约 49.4 亿美元。</w:t>
+      </w:r>
+      <w:r>
+        <w:rPr>
+          <w:rFonts w:ascii="Microsoft YaHei" w:hAnsi="Microsoft YaHei" w:eastAsia="Microsoft YaHei"/>
+          <w:b w:val="0"/>
+          <w:color w:val="1F4D78"/>
+          <w:sz w:val="16"/>
+          <w:vertAlign w:val="superscript"/>
+        </w:rPr>
+        <w:t>〔7〕</w:t>
+      </w:r>
+    </w:p>
+    <w:p>
+      <w:pPr>
+        <w:pStyle w:val="ListBullet"/>
+        <w:spacing w:after="80"/>
+      </w:pPr>
+      <w:r>
+        <w:rPr>
+          <w:rFonts w:ascii="Microsoft YaHei" w:hAnsi="Microsoft YaHei" w:eastAsia="Microsoft YaHei"/>
+          <w:sz w:val="21"/>
+        </w:rPr>
         <w:t>Volza 可见样本中，中国和越南对印 shipment 份额约为 44% 和 28%；印度自香港、印尼、日本的电池进口增量亦可观察。</w:t>
       </w:r>
       <w:r>
@@ -470,7 +539,7 @@
           <w:sz w:val="16"/>
           <w:vertAlign w:val="superscript"/>
         </w:rPr>
-        <w:t>〔5〕</w:t>
+        <w:t>〔8〕</w:t>
       </w:r>
     </w:p>
     <w:p>
@@ -495,7 +564,7 @@
           <w:rFonts w:ascii="Microsoft YaHei" w:hAnsi="Microsoft YaHei" w:eastAsia="Microsoft YaHei"/>
           <w:sz w:val="21"/>
         </w:rPr>
-        <w:t>在中国海关出口镜像中，HS6 850760 下共匹配 1 个真实 HS8 子项。2025 年中国出口至印度金额为 3.76 十亿美元；2026 年已导出月份合计为 2.84 十亿美元。2025—2026 已导出月份中，月度峰值出现在 202512，金额为 586.45 百万美元。</w:t>
+        <w:t>在中国海关出口镜像中，HS6 850760 下共匹配 1 个真实 HS8 子项。2025 年中国出口至印度金额为 7.51 十亿美元；2026 年已导出月份合计为 5.67 十亿美元。2025—2026 已导出月份中，月度峰值出现在 202512，金额为 1.17 十亿美元。</w:t>
       </w:r>
       <w:r>
         <w:rPr>
@@ -505,7 +574,7 @@
           <w:sz w:val="16"/>
           <w:vertAlign w:val="superscript"/>
         </w:rPr>
-        <w:t>〔6〕</w:t>
+        <w:t>〔9〕</w:t>
       </w:r>
     </w:p>
     <w:tbl>
@@ -682,7 +751,7 @@
                 <w:color w:val="000000"/>
                 <w:sz w:val="19"/>
               </w:rPr>
-              <w:t>3.76 十亿美元</w:t>
+              <w:t>7.51 十亿美元</w:t>
             </w:r>
           </w:p>
         </w:tc>
@@ -751,7 +820,12 @@
     </w:p>
     <w:p>
       <w:r>
-        <w:t>87.2% 的对华来源占比意味着短期替代弹性有限，尤其在锂离子电芯、BMS 和关键材料层面可能高于 HS4 表面值。</w:t>
+        <w:t>87.2% 的对华来源占比与印度政府对中游加工能力脆弱性的表述相互印证，说明风险不只在成品蓄电池贸易额，还延伸至正负极材料、电芯技术、BMS、制造工艺和关键设备调试能力。</w:t>
+      </w:r>
+    </w:p>
+    <w:p>
+      <w:r>
+        <w:t>企业技术合作证据表明，印度本土化并不等于完全脱离中国供应链。即便未来印度本地完成 PACK 或电芯制造，关键知识产权、材料认证和供应链整合仍可能形成持续依赖。</w:t>
       </w:r>
     </w:p>
     <w:p>
@@ -784,7 +858,7 @@
     </w:p>
     <w:p>
       <w:r>
-        <w:t>蓄电池应被列为最高优先级供应安全品类。越南是首要路径节点，但现有证据不足以认定大规模非法转口；企业应按电芯—模组—PACK 三层拆分来源。</w:t>
+        <w:t>锂离子蓄电池应列为高概率、高优先级供应安全品类。当前可确认印度在电池包、正负极材料、制造技术和中游加工环节对中国依赖较高；越南是首要路径筛查节点，但现有证据不足以认定大规模非法转口。</w:t>
       </w:r>
     </w:p>
     <w:p>
@@ -928,7 +1002,7 @@
           <w:rFonts w:ascii="Microsoft YaHei" w:hAnsi="Microsoft YaHei" w:eastAsia="Microsoft YaHei"/>
           <w:sz w:val="18"/>
         </w:rPr>
-        <w:t>OEC 2024 电池双边贸易结构</w:t>
+        <w:t>Moneycontrol：《India’s critical mineral trade is up 10x in ten years: MC Analysis》，2024-10-21</w:t>
       </w:r>
     </w:p>
     <w:p>
@@ -949,7 +1023,7 @@
           <w:rFonts w:ascii="Microsoft YaHei" w:hAnsi="Microsoft YaHei" w:eastAsia="Microsoft YaHei"/>
           <w:sz w:val="18"/>
         </w:rPr>
-        <w:t>Volza HS 8507 对印 shipment 开放摘要</w:t>
+        <w:t>Amara Raja Group：《Amara Raja Announces Strategic Technology Collaboration with Gotion-InoBat-Batteries (GIB)》，2024-06-24</w:t>
       </w:r>
     </w:p>
     <w:p>
@@ -970,7 +1044,7 @@
           <w:rFonts w:ascii="Microsoft YaHei" w:hAnsi="Microsoft YaHei" w:eastAsia="Microsoft YaHei"/>
           <w:sz w:val="18"/>
         </w:rPr>
-        <w:t>海关总署统计网，中国出口至印度，贸易伙伴编码 111，HS6 850760 下真实 HS8 明细，来源文件 数据导出.csv、数据导出 (1).csv，访问日期 2026-07-24。</w:t>
+        <w:t>OEC 2024 电池双边贸易结构</w:t>
       </w:r>
     </w:p>
     <w:p>
@@ -991,7 +1065,7 @@
           <w:rFonts w:ascii="Microsoft YaHei" w:hAnsi="Microsoft YaHei" w:eastAsia="Microsoft YaHei"/>
           <w:sz w:val="18"/>
         </w:rPr>
-        <w:t>研究报告第 6—7 页：HS 8507 路径证据</w:t>
+        <w:t>Volza HS 8507 对印 shipment 开放摘要</w:t>
       </w:r>
     </w:p>
     <w:p>
@@ -1012,7 +1086,7 @@
           <w:rFonts w:ascii="Microsoft YaHei" w:hAnsi="Microsoft YaHei" w:eastAsia="Microsoft YaHei"/>
           <w:sz w:val="18"/>
         </w:rPr>
-        <w:t>OEC 2024 电池双边贸易结构</w:t>
+        <w:t>Volza HS 8507 对印 shipment 开放摘要</w:t>
       </w:r>
     </w:p>
     <w:p>
@@ -1033,7 +1107,7 @@
           <w:rFonts w:ascii="Microsoft YaHei" w:hAnsi="Microsoft YaHei" w:eastAsia="Microsoft YaHei"/>
           <w:sz w:val="18"/>
         </w:rPr>
-        <w:t>Volza HS 8507 对印 shipment 开放摘要</w:t>
+        <w:t>海关总署统计网，中国出口至印度，贸易伙伴编码 111，HS6 850760 下真实 HS8 明细，来源文件 数据导出.csv、数据导出 (1).csv、数据导出 (4).csv、数据导出 (5).csv，访问日期 2026-07-28。</w:t>
       </w:r>
     </w:p>
     <w:p>
@@ -1054,7 +1128,7 @@
           <w:rFonts w:ascii="Microsoft YaHei" w:hAnsi="Microsoft YaHei" w:eastAsia="Microsoft YaHei"/>
           <w:sz w:val="18"/>
         </w:rPr>
-        <w:t>UN Comtrade 公共 API，报告国印度（reporterCode=699），贸易伙伴中国/世界（partnerCode=156/0），flowCode=M，cmdCode=850760，period=2025；访问日期 2026-07-24。</w:t>
+        <w:t>印度新闻信息局（PIB）/印度重工业部：《Impact on EV Due to Policy Changes in China Pertaining to Lithium》，2026-03-17</w:t>
       </w:r>
     </w:p>
     <w:p>
@@ -1075,7 +1149,7 @@
           <w:rFonts w:ascii="Microsoft YaHei" w:hAnsi="Microsoft YaHei" w:eastAsia="Microsoft YaHei"/>
           <w:sz w:val="18"/>
         </w:rPr>
-        <w:t>印度 DGCI&amp;S TradeStat：月度贸易数据库与编码调整说明。</w:t>
+        <w:t>Moneycontrol：《India’s critical mineral trade is up 10x in ten years: MC Analysis》，2024-10-21</w:t>
       </w:r>
     </w:p>
     <w:p>
@@ -1096,7 +1170,7 @@
           <w:rFonts w:ascii="Microsoft YaHei" w:hAnsi="Microsoft YaHei" w:eastAsia="Microsoft YaHei"/>
           <w:sz w:val="18"/>
         </w:rPr>
-        <w:t>中国商务部、海关总署及中国出口管制信息网：现行两用物项清单、公告与许可证管理目录。</w:t>
+        <w:t>Amara Raja Group：《Amara Raja Announces Strategic Technology Collaboration with Gotion-InoBat-Batteries (GIB)》，2024-06-24</w:t>
       </w:r>
     </w:p>
     <w:p>
@@ -1117,7 +1191,112 @@
           <w:rFonts w:ascii="Microsoft YaHei" w:hAnsi="Microsoft YaHei" w:eastAsia="Microsoft YaHei"/>
           <w:sz w:val="18"/>
         </w:rPr>
-        <w:t>海关总署统计网，中国出口至印度，贸易伙伴编码 111，HS6 850760 下真实 HS8 明细，来源文件 数据导出.csv、数据导出 (1).csv，访问日期 2026-07-24。</w:t>
+        <w:t>OEC 2024 电池双边贸易结构</w:t>
+      </w:r>
+    </w:p>
+    <w:p>
+      <w:pPr>
+        <w:spacing w:after="60"/>
+      </w:pPr>
+      <w:r>
+        <w:rPr>
+          <w:rFonts w:ascii="Microsoft YaHei" w:hAnsi="Microsoft YaHei" w:eastAsia="Microsoft YaHei"/>
+          <w:b/>
+          <w:color w:val="1F4D78"/>
+          <w:sz w:val="18"/>
+        </w:rPr>
+        <w:t>〔14〕</w:t>
+      </w:r>
+      <w:r>
+        <w:rPr>
+          <w:rFonts w:ascii="Microsoft YaHei" w:hAnsi="Microsoft YaHei" w:eastAsia="Microsoft YaHei"/>
+          <w:sz w:val="18"/>
+        </w:rPr>
+        <w:t>Volza HS 8507 对印 shipment 开放摘要</w:t>
+      </w:r>
+    </w:p>
+    <w:p>
+      <w:pPr>
+        <w:spacing w:after="60"/>
+      </w:pPr>
+      <w:r>
+        <w:rPr>
+          <w:rFonts w:ascii="Microsoft YaHei" w:hAnsi="Microsoft YaHei" w:eastAsia="Microsoft YaHei"/>
+          <w:b/>
+          <w:color w:val="1F4D78"/>
+          <w:sz w:val="18"/>
+        </w:rPr>
+        <w:t>〔15〕</w:t>
+      </w:r>
+      <w:r>
+        <w:rPr>
+          <w:rFonts w:ascii="Microsoft YaHei" w:hAnsi="Microsoft YaHei" w:eastAsia="Microsoft YaHei"/>
+          <w:sz w:val="18"/>
+        </w:rPr>
+        <w:t>UN Comtrade 公共 API，报告国印度（reporterCode=699），贸易伙伴中国/世界（partnerCode=156/0），flowCode=M，cmdCode=850760，period=2025；访问日期 2026-07-24。</w:t>
+      </w:r>
+    </w:p>
+    <w:p>
+      <w:pPr>
+        <w:spacing w:after="60"/>
+      </w:pPr>
+      <w:r>
+        <w:rPr>
+          <w:rFonts w:ascii="Microsoft YaHei" w:hAnsi="Microsoft YaHei" w:eastAsia="Microsoft YaHei"/>
+          <w:b/>
+          <w:color w:val="1F4D78"/>
+          <w:sz w:val="18"/>
+        </w:rPr>
+        <w:t>〔16〕</w:t>
+      </w:r>
+      <w:r>
+        <w:rPr>
+          <w:rFonts w:ascii="Microsoft YaHei" w:hAnsi="Microsoft YaHei" w:eastAsia="Microsoft YaHei"/>
+          <w:sz w:val="18"/>
+        </w:rPr>
+        <w:t>印度 DGCI&amp;S TradeStat：月度贸易数据库与编码调整说明。</w:t>
+      </w:r>
+    </w:p>
+    <w:p>
+      <w:pPr>
+        <w:spacing w:after="60"/>
+      </w:pPr>
+      <w:r>
+        <w:rPr>
+          <w:rFonts w:ascii="Microsoft YaHei" w:hAnsi="Microsoft YaHei" w:eastAsia="Microsoft YaHei"/>
+          <w:b/>
+          <w:color w:val="1F4D78"/>
+          <w:sz w:val="18"/>
+        </w:rPr>
+        <w:t>〔17〕</w:t>
+      </w:r>
+      <w:r>
+        <w:rPr>
+          <w:rFonts w:ascii="Microsoft YaHei" w:hAnsi="Microsoft YaHei" w:eastAsia="Microsoft YaHei"/>
+          <w:sz w:val="18"/>
+        </w:rPr>
+        <w:t>中国商务部、海关总署及中国出口管制信息网：现行两用物项清单、公告与许可证管理目录。</w:t>
+      </w:r>
+    </w:p>
+    <w:p>
+      <w:pPr>
+        <w:spacing w:after="60"/>
+      </w:pPr>
+      <w:r>
+        <w:rPr>
+          <w:rFonts w:ascii="Microsoft YaHei" w:hAnsi="Microsoft YaHei" w:eastAsia="Microsoft YaHei"/>
+          <w:b/>
+          <w:color w:val="1F4D78"/>
+          <w:sz w:val="18"/>
+        </w:rPr>
+        <w:t>〔18〕</w:t>
+      </w:r>
+      <w:r>
+        <w:rPr>
+          <w:rFonts w:ascii="Microsoft YaHei" w:hAnsi="Microsoft YaHei" w:eastAsia="Microsoft YaHei"/>
+          <w:sz w:val="18"/>
+        </w:rPr>
+        <w:t>海关总署统计网，中国出口至印度，贸易伙伴编码 111，HS6 850760 下真实 HS8 明细，来源文件 数据导出.csv、数据导出 (1).csv、数据导出 (4).csv、数据导出 (5).csv，访问日期 2026-07-28。</w:t>
       </w:r>
     </w:p>
     <w:p>

</xml_diff>